<commit_message>
Strengthen six application packages and their evidence checks
Reassess six selected vacancies with the Terra high profile, publish grounded CVs and cover letters, and enforce role depth, chronology, opening, and backup checks.
</commit_message>
<xml_diff>
--- a/registry/jobs/2026-09-14_180905_talmatic_senior-go-golang-software-engineer/application/CV_ValentinNikolaev_talmatic_SeniorGoGolangSoftwareEngineer.docx
+++ b/registry/jobs/2026-09-14_180905_talmatic_senior-go-golang-software-engineer/application/CV_ValentinNikolaev_talmatic_SeniorGoGolangSoftwareEngineer.docx
@@ -55,7 +55,7 @@
         </w:rPr>
         <w:t xml:space="preserve">Rome, Italy | </w:t>
       </w:r>
-      <w:hyperlink w:history="1" r:id="rIdsfeebiu6q1ch0ejk36qsh">
+      <w:hyperlink w:history="1" r:id="rIddciphpws1l_uc3hzxw42g">
         <w:r>
           <w:rPr>
             <w:rFonts w:ascii="Aptos" w:cs="Aptos" w:eastAsia="Aptos" w:hAnsi="Aptos"/>
@@ -89,7 +89,7 @@
         <w:t xml:space="preserve">
 </w:t>
       </w:r>
-      <w:hyperlink w:history="1" r:id="rIdgn3kzc2vk4yrlvyieoyqt">
+      <w:hyperlink w:history="1" r:id="rIdf5q7du4hrcw00gntlcsqb">
         <w:r>
           <w:rPr>
             <w:rFonts w:ascii="Aptos" w:cs="Aptos" w:eastAsia="Aptos" w:hAnsi="Aptos"/>
@@ -112,7 +112,7 @@
         </w:rPr>
         <w:t xml:space="preserve"> | </w:t>
       </w:r>
-      <w:hyperlink w:history="1" r:id="rIdc7hhml9egugr8ufwumgmj">
+      <w:hyperlink w:history="1" r:id="rIddzizusivce2y9wttlzdmj">
         <w:r>
           <w:rPr>
             <w:rFonts w:ascii="Aptos" w:cs="Aptos" w:eastAsia="Aptos" w:hAnsi="Aptos"/>
@@ -160,7 +160,7 @@
           <w:szCs w:val="24"/>
           <w:rtl w:val="false"/>
         </w:rPr>
-        <w:t xml:space="preserve">Backend engineer and technical lead with 15+ years of experience building production systems across Go and PHP. I design and own a support automation platform that connects Zendesk, Intercom, and internal services through a robust, scalable backend in Go. Recent work centers on distributed service reliability, SQL performance, and architecture decisions for SaaS products. Brings hands-on ownership from system design through operations, including high-volume platform responsibility, monitoring-led troubleshooting, technical planning, and knowledge sharing. Comfortable collaborating in English with product and engineering partners while keeping delivery pragmatic and observable.</w:t>
+        <w:t xml:space="preserve">Backend engineer and technical lead with more than 15 years building production systems in Go and PHP. Recent work includes architecture and operational ownership of Go services for support automation, vendor integrations and AWS telephony. I have simplified data pipelines, addressed failures in production batch processing and reduced database load in earlier SaaS work. My contribution spans design, delivery and diagnosis, with experience explaining technical choices to product and engineering colleagues. I bring this mix of hands-on Go engineering, SQL performance work and accountable system design to complex backend platforms.</w:t>
       </w:r>
     </w:p>
     <w:p>
@@ -209,18 +209,7 @@
           <w:szCs w:val="24"/>
           <w:rtl w:val="false"/>
         </w:rPr>
-        <w:t xml:space="preserve"> Go, PHP, REST APIs, microservices, event-driven systems, system design, software architecture</w:t>
-      </w:r>
-      <w:r>
-        <w:rPr>
-          <w:rFonts w:ascii="Aptos" w:cs="Aptos" w:eastAsia="Aptos" w:hAnsi="Aptos"/>
-          <w:color w:val="000000"/>
-          <w:sz w:val="24"/>
-          <w:szCs w:val="24"/>
-          <w:rtl w:val="false"/>
-        </w:rPr>
-        <w:t xml:space="preserve">
-</w:t>
+        <w:t xml:space="preserve"> Go, PHP, REST APIs, OpenAPI, event-driven systems; </w:t>
       </w:r>
       <w:r>
         <w:rPr>
@@ -232,28 +221,17 @@
           <w:szCs w:val="24"/>
           <w:rtl w:val="false"/>
         </w:rPr>
-        <w:t xml:space="preserve">Data and search:</w:t>
-      </w:r>
-      <w:r>
-        <w:rPr>
-          <w:rFonts w:ascii="Aptos" w:cs="Aptos" w:eastAsia="Aptos" w:hAnsi="Aptos"/>
-          <w:color w:val="000000"/>
-          <w:sz w:val="24"/>
-          <w:szCs w:val="24"/>
-          <w:rtl w:val="false"/>
-        </w:rPr>
-        <w:t xml:space="preserve"> SQL, MySQL, PostgreSQL, Elasticsearch, performance optimization</w:t>
-      </w:r>
-      <w:r>
-        <w:rPr>
-          <w:rFonts w:ascii="Aptos" w:cs="Aptos" w:eastAsia="Aptos" w:hAnsi="Aptos"/>
-          <w:color w:val="000000"/>
-          <w:sz w:val="24"/>
-          <w:szCs w:val="24"/>
-          <w:rtl w:val="false"/>
-        </w:rPr>
-        <w:t xml:space="preserve">
-</w:t>
+        <w:t xml:space="preserve">Data:</w:t>
+      </w:r>
+      <w:r>
+        <w:rPr>
+          <w:rFonts w:ascii="Aptos" w:cs="Aptos" w:eastAsia="Aptos" w:hAnsi="Aptos"/>
+          <w:color w:val="000000"/>
+          <w:sz w:val="24"/>
+          <w:szCs w:val="24"/>
+          <w:rtl w:val="false"/>
+        </w:rPr>
+        <w:t xml:space="preserve"> SQL, PostgreSQL, MySQL, Snowflake, Elasticsearch, database performance; </w:t>
       </w:r>
       <w:r>
         <w:rPr>
@@ -265,50 +243,17 @@
           <w:szCs w:val="24"/>
           <w:rtl w:val="false"/>
         </w:rPr>
-        <w:t xml:space="preserve">Cloud and delivery:</w:t>
-      </w:r>
-      <w:r>
-        <w:rPr>
-          <w:rFonts w:ascii="Aptos" w:cs="Aptos" w:eastAsia="Aptos" w:hAnsi="Aptos"/>
-          <w:color w:val="000000"/>
-          <w:sz w:val="24"/>
-          <w:szCs w:val="24"/>
-          <w:rtl w:val="false"/>
-        </w:rPr>
-        <w:t xml:space="preserve"> AWS, Kubernetes, GitHub Actions, CI/CD</w:t>
-      </w:r>
-      <w:r>
-        <w:rPr>
-          <w:rFonts w:ascii="Aptos" w:cs="Aptos" w:eastAsia="Aptos" w:hAnsi="Aptos"/>
-          <w:color w:val="000000"/>
-          <w:sz w:val="24"/>
-          <w:szCs w:val="24"/>
-          <w:rtl w:val="false"/>
-        </w:rPr>
-        <w:t xml:space="preserve">
-</w:t>
-      </w:r>
-      <w:r>
-        <w:rPr>
-          <w:rFonts w:ascii="Aptos" w:cs="Aptos" w:eastAsia="Aptos" w:hAnsi="Aptos"/>
-          <w:b/>
-          <w:bCs/>
-          <w:color w:val="000000"/>
-          <w:sz w:val="24"/>
-          <w:szCs w:val="24"/>
-          <w:rtl w:val="false"/>
-        </w:rPr>
-        <w:t xml:space="preserve">Reliability and collaboration:</w:t>
-      </w:r>
-      <w:r>
-        <w:rPr>
-          <w:rFonts w:ascii="Aptos" w:cs="Aptos" w:eastAsia="Aptos" w:hAnsi="Aptos"/>
-          <w:color w:val="000000"/>
-          <w:sz w:val="24"/>
-          <w:szCs w:val="24"/>
-          <w:rtl w:val="false"/>
-        </w:rPr>
-        <w:t xml:space="preserve"> monitoring, logging, Prometheus, production reliability, on-call operations</w:t>
+        <w:t xml:space="preserve">Cloud and operations:</w:t>
+      </w:r>
+      <w:r>
+        <w:rPr>
+          <w:rFonts w:ascii="Aptos" w:cs="Aptos" w:eastAsia="Aptos" w:hAnsi="Aptos"/>
+          <w:color w:val="000000"/>
+          <w:sz w:val="24"/>
+          <w:szCs w:val="24"/>
+          <w:rtl w:val="false"/>
+        </w:rPr>
+        <w:t xml:space="preserve"> AWS, Amazon Connect, SQS, Kubernetes, CI/CD, monitoring, Prometheus</w:t>
       </w:r>
     </w:p>
     <w:p>
@@ -337,6 +282,7 @@
         <w:pStyle w:val="Heading3"/>
         <w:bidi w:val="false"/>
         <w:spacing w:after="120" w:before="240"/>
+        <w:keepNext/>
       </w:pPr>
       <w:bookmarkStart w:name="_Toc_Simplelife_Simple_App_Software_Developer_5" w:id="1"/>
       <w:r>
@@ -356,16 +302,17 @@
         <w:bidi w:val="false"/>
         <w:spacing w:after="120" w:before="120" w:line="259.20000000000005"/>
         <w:jc w:val="left"/>
-      </w:pPr>
-      <w:r>
-        <w:rPr>
-          <w:rFonts w:ascii="Aptos" w:cs="Aptos" w:eastAsia="Aptos" w:hAnsi="Aptos"/>
-          <w:color w:val="000000"/>
-          <w:sz w:val="24"/>
-          <w:szCs w:val="24"/>
-          <w:rtl w:val="false"/>
-        </w:rPr>
-        <w:t xml:space="preserve">November 2023–July 2026</w:t>
+        <w:keepNext/>
+      </w:pPr>
+      <w:r>
+        <w:rPr>
+          <w:rFonts w:ascii="Aptos" w:cs="Aptos" w:eastAsia="Aptos" w:hAnsi="Aptos"/>
+          <w:color w:val="000000"/>
+          <w:sz w:val="24"/>
+          <w:szCs w:val="24"/>
+          <w:rtl w:val="false"/>
+        </w:rPr>
+        <w:t xml:space="preserve">November 2023–2026</w:t>
       </w:r>
     </w:p>
     <w:p>
@@ -386,7 +333,7 @@
           <w:szCs w:val="24"/>
           <w:rtl w:val="false"/>
         </w:rPr>
-        <w:t xml:space="preserve">Designed and owned a Go backend platform connecting Zendesk, Intercom, and internal services so support operations could run at scale during peak load.</w:t>
+        <w:t xml:space="preserve">Architected an Amazon Connect outbound-calling backend with federated agent access, removing per-agent AWS accounts and SAML setup; it passed security sign-off and entered production.</w:t>
       </w:r>
     </w:p>
     <w:p>
@@ -407,7 +354,7 @@
           <w:szCs w:val="24"/>
           <w:rtl w:val="false"/>
         </w:rPr>
-        <w:t xml:space="preserve">Personally owned platform operations for at least 20,000 tickets in an ordinary month and up to three times that volume during the US peak season.</w:t>
+        <w:t xml:space="preserve">Replaced three duplicated Snowflake-to-Intercom pipelines with one two-phase engine, reducing the implementation from 1,670 to 800 lines, expanding process test coverage from one to three and removing a 100-item daily cap.</w:t>
       </w:r>
     </w:p>
     <w:p>
@@ -428,7 +375,7 @@
           <w:szCs w:val="24"/>
           <w:rtl w:val="false"/>
         </w:rPr>
-        <w:t xml:space="preserve">Implemented many automation scenarios on a platform that reaches up to 86% fully automated handling, measured through internal Intercom and backend metrics exported to Grafana.</w:t>
+        <w:t xml:space="preserve">Diagnosed fatal cron runs during Intercom API degradation and introduced partial-success reporting plus parallel, time-sharded cursor scans so incomplete work was visible without failing the entire run.</w:t>
       </w:r>
     </w:p>
     <w:p>
@@ -449,61 +396,7 @@
           <w:szCs w:val="24"/>
           <w:rtl w:val="false"/>
         </w:rPr>
-        <w:t xml:space="preserve">Built a unified API orchestration layer for ticket routing, classification, and lifecycle tracking.</w:t>
-      </w:r>
-    </w:p>
-    <w:p>
-      <w:pPr>
-        <w:bidi w:val="false"/>
-        <w:spacing w:after="120" w:before="120" w:line="259.20000000000005"/>
-        <w:jc w:val="left"/>
-      </w:pPr>
-      <w:r>
-        <w:rPr>
-          <w:rFonts w:ascii="Aptos" w:cs="Aptos" w:eastAsia="Aptos" w:hAnsi="Aptos"/>
-          <w:color w:val="000000"/>
-          <w:sz w:val="24"/>
-          <w:szCs w:val="24"/>
-          <w:rtl w:val="false"/>
-        </w:rPr>
-        <w:t xml:space="preserve">Technologies: Go, REST APIs, Zendesk, Intercom, monitoring, Grafana</w:t>
-      </w:r>
-    </w:p>
-    <w:p>
-      <w:pPr>
-        <w:pStyle w:val="3"/>
-        <w:pStyle w:val="Heading3"/>
-        <w:bidi w:val="false"/>
-        <w:spacing w:after="120" w:before="240"/>
-      </w:pPr>
-      <w:bookmarkStart w:name="_Toc_CRURATED_PHP_Software_Developer_concurre_6" w:id="1"/>
-      <w:r>
-        <w:rPr>
-          <w:rFonts w:ascii="Aptos" w:cs="Aptos" w:eastAsia="Aptos" w:hAnsi="Aptos"/>
-          <w:color w:val="000000"/>
-          <w:sz w:val="24"/>
-          <w:szCs w:val="24"/>
-          <w:rtl w:val="false"/>
-        </w:rPr>
-        <w:t xml:space="preserve">CRURATED — PHP Software Developer, concurrent part-time consulting engagement</w:t>
-      </w:r>
-      <w:bookmarkEnd w:id="1"/>
-    </w:p>
-    <w:p>
-      <w:pPr>
-        <w:bidi w:val="false"/>
-        <w:spacing w:after="120" w:before="120" w:line="259.20000000000005"/>
-        <w:jc w:val="left"/>
-      </w:pPr>
-      <w:r>
-        <w:rPr>
-          <w:rFonts w:ascii="Aptos" w:cs="Aptos" w:eastAsia="Aptos" w:hAnsi="Aptos"/>
-          <w:color w:val="000000"/>
-          <w:sz w:val="24"/>
-          <w:szCs w:val="24"/>
-          <w:rtl w:val="false"/>
-        </w:rPr>
-        <w:t xml:space="preserve">August 2024–January 2026</w:t>
+        <w:t xml:space="preserve">Designed and operated a Go support platform connecting Zendesk, Intercom and internal services, handling at least 20,000 tickets in an ordinary month and up to three times that volume during the US peak season.</w:t>
       </w:r>
     </w:p>
     <w:p>
@@ -524,7 +417,63 @@
           <w:szCs w:val="24"/>
           <w:rtl w:val="false"/>
         </w:rPr>
-        <w:t xml:space="preserve">Held full technical ownership for production DataLake and event analytics work.</w:t>
+        <w:t xml:space="preserve">Built a vendor-neutral Go helpdesk gateway with Intercom and Zendesk adapters, tenant-specific event ingestion and SQS queues, enabling the company's first B2B support-AI demo.</w:t>
+      </w:r>
+    </w:p>
+    <w:p>
+      <w:pPr>
+        <w:bidi w:val="false"/>
+        <w:spacing w:after="120" w:before="120" w:line="259.20000000000005"/>
+        <w:jc w:val="left"/>
+      </w:pPr>
+      <w:r>
+        <w:rPr>
+          <w:rFonts w:ascii="Aptos" w:cs="Aptos" w:eastAsia="Aptos" w:hAnsi="Aptos"/>
+          <w:color w:val="000000"/>
+          <w:sz w:val="24"/>
+          <w:szCs w:val="24"/>
+          <w:rtl w:val="false"/>
+        </w:rPr>
+        <w:t xml:space="preserve">Technologies: Go, PHP, PostgreSQL, AWS, Amazon Connect, SQS, Kubernetes, Snowflake, Intercom, Zendesk, REST APIs</w:t>
+      </w:r>
+    </w:p>
+    <w:p>
+      <w:pPr>
+        <w:pStyle w:val="3"/>
+        <w:pStyle w:val="Heading3"/>
+        <w:bidi w:val="false"/>
+        <w:spacing w:after="120" w:before="240"/>
+        <w:keepNext/>
+      </w:pPr>
+      <w:bookmarkStart w:name="_Toc_CRURATED_PHP_Software_Developer_concurre_6" w:id="1"/>
+      <w:r>
+        <w:rPr>
+          <w:rFonts w:ascii="Aptos" w:cs="Aptos" w:eastAsia="Aptos" w:hAnsi="Aptos"/>
+          <w:color w:val="000000"/>
+          <w:sz w:val="24"/>
+          <w:szCs w:val="24"/>
+          <w:rtl w:val="false"/>
+        </w:rPr>
+        <w:t xml:space="preserve">CRURATED — PHP Software Developer, concurrent part-time consulting engagement</w:t>
+      </w:r>
+      <w:bookmarkEnd w:id="1"/>
+    </w:p>
+    <w:p>
+      <w:pPr>
+        <w:bidi w:val="false"/>
+        <w:spacing w:after="120" w:before="120" w:line="259.20000000000005"/>
+        <w:jc w:val="left"/>
+        <w:keepNext/>
+      </w:pPr>
+      <w:r>
+        <w:rPr>
+          <w:rFonts w:ascii="Aptos" w:cs="Aptos" w:eastAsia="Aptos" w:hAnsi="Aptos"/>
+          <w:color w:val="000000"/>
+          <w:sz w:val="24"/>
+          <w:szCs w:val="24"/>
+          <w:rtl w:val="false"/>
+        </w:rPr>
+        <w:t xml:space="preserve">August 2024–January 2026</w:t>
       </w:r>
     </w:p>
     <w:p>
@@ -545,7 +494,7 @@
           <w:szCs w:val="24"/>
           <w:rtl w:val="false"/>
         </w:rPr>
-        <w:t xml:space="preserve">Built production event-version publication with full technical ownership.</w:t>
+        <w:t xml:space="preserve">Owned the production DataLake and event analytics work as throughput grew by more than tenfold, with Grafana and operational observation used to assess the increase.</w:t>
       </w:r>
     </w:p>
     <w:p>
@@ -566,61 +515,7 @@
           <w:szCs w:val="24"/>
           <w:rtl w:val="false"/>
         </w:rPr>
-        <w:t xml:space="preserve">Owned production authentication, OTP, account linking, collection import/export, purchase-ownership verification, and request/response logging for the Crutrade integration.</w:t>
-      </w:r>
-    </w:p>
-    <w:p>
-      <w:pPr>
-        <w:bidi w:val="false"/>
-        <w:spacing w:after="120" w:before="120" w:line="259.20000000000005"/>
-        <w:jc w:val="left"/>
-      </w:pPr>
-      <w:r>
-        <w:rPr>
-          <w:rFonts w:ascii="Aptos" w:cs="Aptos" w:eastAsia="Aptos" w:hAnsi="Aptos"/>
-          <w:color w:val="000000"/>
-          <w:sz w:val="24"/>
-          <w:szCs w:val="24"/>
-          <w:rtl w:val="false"/>
-        </w:rPr>
-        <w:t xml:space="preserve">Technologies: PHP, event analytics, DataLake, EventBridge, queues, REST APIs</w:t>
-      </w:r>
-    </w:p>
-    <w:p>
-      <w:pPr>
-        <w:pStyle w:val="3"/>
-        <w:pStyle w:val="Heading3"/>
-        <w:bidi w:val="false"/>
-        <w:spacing w:after="120" w:before="240"/>
-      </w:pPr>
-      <w:bookmarkStart w:name="_Toc_airSlate_Programming_Team_Lead_Software__7" w:id="1"/>
-      <w:r>
-        <w:rPr>
-          <w:rFonts w:ascii="Aptos" w:cs="Aptos" w:eastAsia="Aptos" w:hAnsi="Aptos"/>
-          <w:color w:val="000000"/>
-          <w:sz w:val="24"/>
-          <w:szCs w:val="24"/>
-          <w:rtl w:val="false"/>
-        </w:rPr>
-        <w:t xml:space="preserve">airSlate — Programming Team Lead / Software Developer</w:t>
-      </w:r>
-      <w:bookmarkEnd w:id="1"/>
-    </w:p>
-    <w:p>
-      <w:pPr>
-        <w:bidi w:val="false"/>
-        <w:spacing w:after="120" w:before="120" w:line="259.20000000000005"/>
-        <w:jc w:val="left"/>
-      </w:pPr>
-      <w:r>
-        <w:rPr>
-          <w:rFonts w:ascii="Aptos" w:cs="Aptos" w:eastAsia="Aptos" w:hAnsi="Aptos"/>
-          <w:color w:val="000000"/>
-          <w:sz w:val="24"/>
-          <w:szCs w:val="24"/>
-          <w:rtl w:val="false"/>
-        </w:rPr>
-        <w:t xml:space="preserve">February 2021–August 2023</w:t>
+        <w:t xml:space="preserve">Delivered parallel publication of event versions in production under full technical ownership.</w:t>
       </w:r>
     </w:p>
     <w:p>
@@ -641,7 +536,63 @@
           <w:szCs w:val="24"/>
           <w:rtl w:val="false"/>
         </w:rPr>
-        <w:t xml:space="preserve">Reduced peak load on the main database by removing bottlenecks and redistributing workload, improving service stability in high-traffic periods.</w:t>
+        <w:t xml:space="preserve">Owned the production Crutrade integration covering authentication and OTP, account linking, collection import and export, purchase-ownership verification and request/response logging.</w:t>
+      </w:r>
+    </w:p>
+    <w:p>
+      <w:pPr>
+        <w:bidi w:val="false"/>
+        <w:spacing w:after="120" w:before="120" w:line="259.20000000000005"/>
+        <w:jc w:val="left"/>
+      </w:pPr>
+      <w:r>
+        <w:rPr>
+          <w:rFonts w:ascii="Aptos" w:cs="Aptos" w:eastAsia="Aptos" w:hAnsi="Aptos"/>
+          <w:color w:val="000000"/>
+          <w:sz w:val="24"/>
+          <w:szCs w:val="24"/>
+          <w:rtl w:val="false"/>
+        </w:rPr>
+        <w:t xml:space="preserve">Technologies: PHP, event analytics, DataLake, EventBridge, REST APIs</w:t>
+      </w:r>
+    </w:p>
+    <w:p>
+      <w:pPr>
+        <w:pStyle w:val="3"/>
+        <w:pStyle w:val="Heading3"/>
+        <w:bidi w:val="false"/>
+        <w:spacing w:after="120" w:before="240"/>
+        <w:keepNext/>
+      </w:pPr>
+      <w:bookmarkStart w:name="_Toc_airSlate_Software_Developer_Programming__7" w:id="1"/>
+      <w:r>
+        <w:rPr>
+          <w:rFonts w:ascii="Aptos" w:cs="Aptos" w:eastAsia="Aptos" w:hAnsi="Aptos"/>
+          <w:color w:val="000000"/>
+          <w:sz w:val="24"/>
+          <w:szCs w:val="24"/>
+          <w:rtl w:val="false"/>
+        </w:rPr>
+        <w:t xml:space="preserve">airSlate — Software Developer / Programming Team Lead</w:t>
+      </w:r>
+      <w:bookmarkEnd w:id="1"/>
+    </w:p>
+    <w:p>
+      <w:pPr>
+        <w:bidi w:val="false"/>
+        <w:spacing w:after="120" w:before="120" w:line="259.20000000000005"/>
+        <w:jc w:val="left"/>
+        <w:keepNext/>
+      </w:pPr>
+      <w:r>
+        <w:rPr>
+          <w:rFonts w:ascii="Aptos" w:cs="Aptos" w:eastAsia="Aptos" w:hAnsi="Aptos"/>
+          <w:color w:val="000000"/>
+          <w:sz w:val="24"/>
+          <w:szCs w:val="24"/>
+          <w:rtl w:val="false"/>
+        </w:rPr>
+        <w:t xml:space="preserve">February 2021–August 2023</w:t>
       </w:r>
     </w:p>
     <w:p>
@@ -662,7 +613,7 @@
           <w:szCs w:val="24"/>
           <w:rtl w:val="false"/>
         </w:rPr>
-        <w:t xml:space="preserve">Troubleshot production issues through logs, monitoring, and SRE dashboards, delivering fixes and operational improvements.</w:t>
+        <w:t xml:space="preserve">Reduced peak load on the main database by removing bottlenecks and redistributing work, improving service stability during high-traffic periods.</w:t>
       </w:r>
     </w:p>
     <w:p>
@@ -683,7 +634,7 @@
           <w:szCs w:val="24"/>
           <w:rtl w:val="false"/>
         </w:rPr>
-        <w:t xml:space="preserve">Led epic decomposition, technical monitoring, and backlog planning from draft through production release.</w:t>
+        <w:t xml:space="preserve">Delivered production fixes after tracing failures through logs, monitoring and SRE dashboards, strengthening day-to-day service operation.</w:t>
       </w:r>
     </w:p>
     <w:p>
@@ -704,7 +655,7 @@
           <w:szCs w:val="24"/>
           <w:rtl w:val="false"/>
         </w:rPr>
-        <w:t xml:space="preserve">Supported technical onboarding, knowledge sharing, personal-development planning, and technical interviews.</w:t>
+        <w:t xml:space="preserve">Developed a Laravel/Symfony logger package to the company's interservice communication standard, giving teams a shared logging implementation.</w:t>
       </w:r>
     </w:p>
     <w:p>
@@ -730,6 +681,7 @@
         <w:pStyle w:val="Heading3"/>
         <w:bidi w:val="false"/>
         <w:spacing w:after="120" w:before="240"/>
+        <w:keepNext/>
       </w:pPr>
       <w:bookmarkStart w:name="_Toc_Hyprr_Technical_Lead_8" w:id="1"/>
       <w:r>
@@ -749,6 +701,7 @@
         <w:bidi w:val="false"/>
         <w:spacing w:after="120" w:before="120" w:line="259.20000000000005"/>
         <w:jc w:val="left"/>
+        <w:keepNext/>
       </w:pPr>
       <w:r>
         <w:rPr>
@@ -779,7 +732,7 @@
           <w:szCs w:val="24"/>
           <w:rtl w:val="false"/>
         </w:rPr>
-        <w:t xml:space="preserve">Helped take the product from prototype to closed beta in less than six months.</w:t>
+        <w:t xml:space="preserve">Helped bring the creator platform from prototype to closed beta in less than six months through technical leadership and backend delivery.</w:t>
       </w:r>
     </w:p>
     <w:p>
@@ -800,7 +753,7 @@
           <w:szCs w:val="24"/>
           <w:rtl w:val="false"/>
         </w:rPr>
-        <w:t xml:space="preserve">Defined the technology roadmap with the CTO and helped establish the core product-delivery stack.</w:t>
+        <w:t xml:space="preserve">Defined the technology roadmap with the CTO and helped establish the core product stack, including microservice and serverless design considerations.</w:t>
       </w:r>
     </w:p>
     <w:p>
@@ -817,7 +770,7 @@
           <w:szCs w:val="24"/>
           <w:rtl w:val="false"/>
         </w:rPr>
-        <w:t xml:space="preserve">Technologies: Go, PHP, AWS, Kubernetes, microservices, serverless, CI/CD</w:t>
+        <w:t xml:space="preserve">Technologies: Go, PHP, Laravel, MySQL, AWS, Kubernetes, microservices, CI/CD</w:t>
       </w:r>
     </w:p>
     <w:p>

</xml_diff>

<commit_message>
Strengthen six CVs and guard against LOC metrics
Regenerate the selected CV-only exports, preserve the existing letters and supporting documents, and reject source-code line counts as CV achievement metrics.
</commit_message>
<xml_diff>
--- a/registry/jobs/2026-09-14_180905_talmatic_senior-go-golang-software-engineer/application/CV_ValentinNikolaev_talmatic_SeniorGoGolangSoftwareEngineer.docx
+++ b/registry/jobs/2026-09-14_180905_talmatic_senior-go-golang-software-engineer/application/CV_ValentinNikolaev_talmatic_SeniorGoGolangSoftwareEngineer.docx
@@ -36,7 +36,7 @@
           <w:szCs w:val="24"/>
           <w:rtl w:val="false"/>
         </w:rPr>
-        <w:t xml:space="preserve">Senior Go/Golang Software Engineer | Backend Architecture and Production Reliability</w:t>
+        <w:t xml:space="preserve">Senior Go/Golang Software Engineer | Distributed Systems and Production Reliability</w:t>
       </w:r>
     </w:p>
     <w:p>
@@ -55,7 +55,7 @@
         </w:rPr>
         <w:t xml:space="preserve">Rome, Italy | </w:t>
       </w:r>
-      <w:hyperlink w:history="1" r:id="rIddciphpws1l_uc3hzxw42g">
+      <w:hyperlink w:history="1" r:id="rIdqvhuvo9atqvxcmpfzcfxt">
         <w:r>
           <w:rPr>
             <w:rFonts w:ascii="Aptos" w:cs="Aptos" w:eastAsia="Aptos" w:hAnsi="Aptos"/>
@@ -89,7 +89,17 @@
         <w:t xml:space="preserve">
 </w:t>
       </w:r>
-      <w:hyperlink w:history="1" r:id="rIdf5q7du4hrcw00gntlcsqb">
+      <w:r>
+        <w:rPr>
+          <w:rFonts w:ascii="Aptos" w:cs="Aptos" w:eastAsia="Aptos" w:hAnsi="Aptos"/>
+          <w:color w:val="000000"/>
+          <w:sz w:val="24"/>
+          <w:szCs w:val="24"/>
+          <w:rtl w:val="false"/>
+        </w:rPr>
+        <w:t xml:space="preserve">LinkedIn: </w:t>
+      </w:r>
+      <w:hyperlink w:history="1" r:id="rIdxh0hf0hmvp5q2dgrrth8w">
         <w:r>
           <w:rPr>
             <w:rFonts w:ascii="Aptos" w:cs="Aptos" w:eastAsia="Aptos" w:hAnsi="Aptos"/>
@@ -99,7 +109,7 @@
             <w:u w:val="single"/>
             <w:rtl w:val="false"/>
           </w:rPr>
-          <w:t xml:space="preserve">LinkedIn</w:t>
+          <w:t xml:space="preserve">https://linkedin.com/in/valentinnikolaev</w:t>
         </w:r>
       </w:hyperlink>
       <w:r>
@@ -110,9 +120,9 @@
           <w:szCs w:val="24"/>
           <w:rtl w:val="false"/>
         </w:rPr>
-        <w:t xml:space="preserve"> | </w:t>
-      </w:r>
-      <w:hyperlink w:history="1" r:id="rIddzizusivce2y9wttlzdmj">
+        <w:t xml:space="preserve"> | GitHub: </w:t>
+      </w:r>
+      <w:hyperlink w:history="1" r:id="rIdrt2osbcqtdya1f9hz9yne">
         <w:r>
           <w:rPr>
             <w:rFonts w:ascii="Aptos" w:cs="Aptos" w:eastAsia="Aptos" w:hAnsi="Aptos"/>
@@ -122,7 +132,7 @@
             <w:u w:val="single"/>
             <w:rtl w:val="false"/>
           </w:rPr>
-          <w:t xml:space="preserve">GitHub</w:t>
+          <w:t xml:space="preserve">https://github.com/ValentinNikolaev</w:t>
         </w:r>
       </w:hyperlink>
     </w:p>
@@ -160,7 +170,7 @@
           <w:szCs w:val="24"/>
           <w:rtl w:val="false"/>
         </w:rPr>
-        <w:t xml:space="preserve">Backend engineer and technical lead with more than 15 years building production systems in Go and PHP. Recent work includes architecture and operational ownership of Go services for support automation, vendor integrations and AWS telephony. I have simplified data pipelines, addressed failures in production batch processing and reduced database load in earlier SaaS work. My contribution spans design, delivery and diagnosis, with experience explaining technical choices to product and engineering colleagues. I bring this mix of hands-on Go engineering, SQL performance work and accountable system design to complex backend platforms.</w:t>
+        <w:t xml:space="preserve">Backend engineer with more than 15 years of experience in Go and PHP production systems. I design services that connect external platforms, make operational failure visible and keep data flows maintainable as they evolve. Recent work includes a secure Amazon Connect backend, a multi-tenant Go integration gateway and resilience improvements for support automation. I also bring experience with event-driven PHP systems, AWS, SQL performance work and cross-service logging standards.</w:t>
       </w:r>
     </w:p>
     <w:p>
@@ -199,17 +209,28 @@
           <w:szCs w:val="24"/>
           <w:rtl w:val="false"/>
         </w:rPr>
-        <w:t xml:space="preserve">Backend and architecture:</w:t>
-      </w:r>
-      <w:r>
-        <w:rPr>
-          <w:rFonts w:ascii="Aptos" w:cs="Aptos" w:eastAsia="Aptos" w:hAnsi="Aptos"/>
-          <w:color w:val="000000"/>
-          <w:sz w:val="24"/>
-          <w:szCs w:val="24"/>
-          <w:rtl w:val="false"/>
-        </w:rPr>
-        <w:t xml:space="preserve"> Go, PHP, REST APIs, OpenAPI, event-driven systems; </w:t>
+        <w:t xml:space="preserve">Backend and APIs:</w:t>
+      </w:r>
+      <w:r>
+        <w:rPr>
+          <w:rFonts w:ascii="Aptos" w:cs="Aptos" w:eastAsia="Aptos" w:hAnsi="Aptos"/>
+          <w:color w:val="000000"/>
+          <w:sz w:val="24"/>
+          <w:szCs w:val="24"/>
+          <w:rtl w:val="false"/>
+        </w:rPr>
+        <w:t xml:space="preserve"> Go, PHP, REST APIs, OpenAPI, event-driven design, distributed systems.</w:t>
+      </w:r>
+      <w:r>
+        <w:rPr>
+          <w:rFonts w:ascii="Aptos" w:cs="Aptos" w:eastAsia="Aptos" w:hAnsi="Aptos"/>
+          <w:color w:val="000000"/>
+          <w:sz w:val="24"/>
+          <w:szCs w:val="24"/>
+          <w:rtl w:val="false"/>
+        </w:rPr>
+        <w:t xml:space="preserve">
+</w:t>
       </w:r>
       <w:r>
         <w:rPr>
@@ -221,17 +242,28 @@
           <w:szCs w:val="24"/>
           <w:rtl w:val="false"/>
         </w:rPr>
-        <w:t xml:space="preserve">Data:</w:t>
-      </w:r>
-      <w:r>
-        <w:rPr>
-          <w:rFonts w:ascii="Aptos" w:cs="Aptos" w:eastAsia="Aptos" w:hAnsi="Aptos"/>
-          <w:color w:val="000000"/>
-          <w:sz w:val="24"/>
-          <w:szCs w:val="24"/>
-          <w:rtl w:val="false"/>
-        </w:rPr>
-        <w:t xml:space="preserve"> SQL, PostgreSQL, MySQL, Snowflake, Elasticsearch, database performance; </w:t>
+        <w:t xml:space="preserve">Data and integration:</w:t>
+      </w:r>
+      <w:r>
+        <w:rPr>
+          <w:rFonts w:ascii="Aptos" w:cs="Aptos" w:eastAsia="Aptos" w:hAnsi="Aptos"/>
+          <w:color w:val="000000"/>
+          <w:sz w:val="24"/>
+          <w:szCs w:val="24"/>
+          <w:rtl w:val="false"/>
+        </w:rPr>
+        <w:t xml:space="preserve"> PostgreSQL, MySQL, SQL performance, Snowflake, Intercom API, Zendesk API, AWS EventBridge.</w:t>
+      </w:r>
+      <w:r>
+        <w:rPr>
+          <w:rFonts w:ascii="Aptos" w:cs="Aptos" w:eastAsia="Aptos" w:hAnsi="Aptos"/>
+          <w:color w:val="000000"/>
+          <w:sz w:val="24"/>
+          <w:szCs w:val="24"/>
+          <w:rtl w:val="false"/>
+        </w:rPr>
+        <w:t xml:space="preserve">
+</w:t>
       </w:r>
       <w:r>
         <w:rPr>
@@ -243,17 +275,17 @@
           <w:szCs w:val="24"/>
           <w:rtl w:val="false"/>
         </w:rPr>
-        <w:t xml:space="preserve">Cloud and operations:</w:t>
-      </w:r>
-      <w:r>
-        <w:rPr>
-          <w:rFonts w:ascii="Aptos" w:cs="Aptos" w:eastAsia="Aptos" w:hAnsi="Aptos"/>
-          <w:color w:val="000000"/>
-          <w:sz w:val="24"/>
-          <w:szCs w:val="24"/>
-          <w:rtl w:val="false"/>
-        </w:rPr>
-        <w:t xml:space="preserve"> AWS, Amazon Connect, SQS, Kubernetes, CI/CD, monitoring, Prometheus</w:t>
+        <w:t xml:space="preserve">Delivery and operations:</w:t>
+      </w:r>
+      <w:r>
+        <w:rPr>
+          <w:rFonts w:ascii="Aptos" w:cs="Aptos" w:eastAsia="Aptos" w:hAnsi="Aptos"/>
+          <w:color w:val="000000"/>
+          <w:sz w:val="24"/>
+          <w:szCs w:val="24"/>
+          <w:rtl w:val="false"/>
+        </w:rPr>
+        <w:t xml:space="preserve"> AWS, Amazon Connect, SQS, Kubernetes, CI/CD, monitoring, production troubleshooting.</w:t>
       </w:r>
     </w:p>
     <w:p>
@@ -312,7 +344,7 @@
           <w:szCs w:val="24"/>
           <w:rtl w:val="false"/>
         </w:rPr>
-        <w:t xml:space="preserve">November 2023–2026</w:t>
+        <w:t xml:space="preserve">November 2023 – 2026</w:t>
       </w:r>
     </w:p>
     <w:p>
@@ -333,7 +365,7 @@
           <w:szCs w:val="24"/>
           <w:rtl w:val="false"/>
         </w:rPr>
-        <w:t xml:space="preserve">Architected an Amazon Connect outbound-calling backend with federated agent access, removing per-agent AWS accounts and SAML setup; it passed security sign-off and entered production.</w:t>
+        <w:t xml:space="preserve">Architected and released an Amazon Connect outbound-calling backend, using federated agent access and masked customer numbers; it passed security sign-off without requiring individual AWS accounts or SAML setup.</w:t>
       </w:r>
     </w:p>
     <w:p>
@@ -354,7 +386,7 @@
           <w:szCs w:val="24"/>
           <w:rtl w:val="false"/>
         </w:rPr>
-        <w:t xml:space="preserve">Replaced three duplicated Snowflake-to-Intercom pipelines with one two-phase engine, reducing the implementation from 1,670 to 800 lines, expanding process test coverage from one to three and removing a 100-item daily cap.</w:t>
+        <w:t xml:space="preserve">Built a multi-tenant Go helpdesk gateway with a vendor-neutral event model, Intercom and Zendesk adapters, tenant event ingestion and SQS queues, enabling the company’s first B2B support-AI demonstration.</w:t>
       </w:r>
     </w:p>
     <w:p>
@@ -375,7 +407,7 @@
           <w:szCs w:val="24"/>
           <w:rtl w:val="false"/>
         </w:rPr>
-        <w:t xml:space="preserve">Diagnosed fatal cron runs during Intercom API degradation and introduced partial-success reporting plus parallel, time-sharded cursor scans so incomplete work was visible without failing the entire run.</w:t>
+        <w:t xml:space="preserve">Stabilized recurring Intercom search failures by tracing the timeout path and introducing partial-success reporting with time-sharded cursor scans, so incomplete processing was observable instead of aborting the run.</w:t>
       </w:r>
     </w:p>
     <w:p>
@@ -396,7 +428,75 @@
           <w:szCs w:val="24"/>
           <w:rtl w:val="false"/>
         </w:rPr>
-        <w:t xml:space="preserve">Designed and operated a Go support platform connecting Zendesk, Intercom and internal services, handling at least 20,000 tickets in an ordinary month and up to three times that volume during the US peak season.</w:t>
+        <w:t xml:space="preserve">Automated GDPR data exports across seven sources through a self-service administration workflow for creating, tracking and reviewing requests.</w:t>
+      </w:r>
+    </w:p>
+    <w:p>
+      <w:pPr>
+        <w:bidi w:val="false"/>
+        <w:spacing w:after="120" w:before="120" w:line="259.20000000000005"/>
+        <w:jc w:val="left"/>
+      </w:pPr>
+      <w:r>
+        <w:rPr>
+          <w:rFonts w:ascii="Aptos" w:cs="Aptos" w:eastAsia="Aptos" w:hAnsi="Aptos"/>
+          <w:b/>
+          <w:bCs/>
+          <w:color w:val="000000"/>
+          <w:sz w:val="24"/>
+          <w:szCs w:val="24"/>
+          <w:rtl w:val="false"/>
+        </w:rPr>
+        <w:t xml:space="preserve">Technologies:</w:t>
+      </w:r>
+      <w:r>
+        <w:rPr>
+          <w:rFonts w:ascii="Aptos" w:cs="Aptos" w:eastAsia="Aptos" w:hAnsi="Aptos"/>
+          <w:color w:val="000000"/>
+          <w:sz w:val="24"/>
+          <w:szCs w:val="24"/>
+          <w:rtl w:val="false"/>
+        </w:rPr>
+        <w:t xml:space="preserve"> Go, PHP, PostgreSQL, AWS, Amazon Connect, SQS, Kubernetes, Snowflake, Intercom API, Zendesk API</w:t>
+      </w:r>
+    </w:p>
+    <w:p>
+      <w:pPr>
+        <w:pStyle w:val="3"/>
+        <w:pStyle w:val="Heading3"/>
+        <w:bidi w:val="false"/>
+        <w:spacing w:after="120" w:before="240"/>
+        <w:keepNext/>
+      </w:pPr>
+      <w:bookmarkStart w:name="_Toc_CRURATED_PHP_Software_Developer_concurre_6" w:id="1"/>
+      <w:r>
+        <w:rPr>
+          <w:rFonts w:ascii="Aptos" w:cs="Aptos" w:eastAsia="Aptos" w:hAnsi="Aptos"/>
+          <w:color w:val="000000"/>
+          <w:sz w:val="24"/>
+          <w:szCs w:val="24"/>
+          <w:rtl w:val="false"/>
+        </w:rPr>
+        <w:t xml:space="preserve">CRURATED — PHP Software Developer, concurrent part-time consulting engagement</w:t>
+      </w:r>
+      <w:bookmarkEnd w:id="1"/>
+    </w:p>
+    <w:p>
+      <w:pPr>
+        <w:bidi w:val="false"/>
+        <w:spacing w:after="120" w:before="120" w:line="259.20000000000005"/>
+        <w:jc w:val="left"/>
+        <w:keepNext/>
+      </w:pPr>
+      <w:r>
+        <w:rPr>
+          <w:rFonts w:ascii="Aptos" w:cs="Aptos" w:eastAsia="Aptos" w:hAnsi="Aptos"/>
+          <w:color w:val="000000"/>
+          <w:sz w:val="24"/>
+          <w:szCs w:val="24"/>
+          <w:rtl w:val="false"/>
+        </w:rPr>
+        <w:t xml:space="preserve">August 2024 – January 2026</w:t>
       </w:r>
     </w:p>
     <w:p>
@@ -417,63 +517,7 @@
           <w:szCs w:val="24"/>
           <w:rtl w:val="false"/>
         </w:rPr>
-        <w:t xml:space="preserve">Built a vendor-neutral Go helpdesk gateway with Intercom and Zendesk adapters, tenant-specific event ingestion and SQS queues, enabling the company's first B2B support-AI demo.</w:t>
-      </w:r>
-    </w:p>
-    <w:p>
-      <w:pPr>
-        <w:bidi w:val="false"/>
-        <w:spacing w:after="120" w:before="120" w:line="259.20000000000005"/>
-        <w:jc w:val="left"/>
-      </w:pPr>
-      <w:r>
-        <w:rPr>
-          <w:rFonts w:ascii="Aptos" w:cs="Aptos" w:eastAsia="Aptos" w:hAnsi="Aptos"/>
-          <w:color w:val="000000"/>
-          <w:sz w:val="24"/>
-          <w:szCs w:val="24"/>
-          <w:rtl w:val="false"/>
-        </w:rPr>
-        <w:t xml:space="preserve">Technologies: Go, PHP, PostgreSQL, AWS, Amazon Connect, SQS, Kubernetes, Snowflake, Intercom, Zendesk, REST APIs</w:t>
-      </w:r>
-    </w:p>
-    <w:p>
-      <w:pPr>
-        <w:pStyle w:val="3"/>
-        <w:pStyle w:val="Heading3"/>
-        <w:bidi w:val="false"/>
-        <w:spacing w:after="120" w:before="240"/>
-        <w:keepNext/>
-      </w:pPr>
-      <w:bookmarkStart w:name="_Toc_CRURATED_PHP_Software_Developer_concurre_6" w:id="1"/>
-      <w:r>
-        <w:rPr>
-          <w:rFonts w:ascii="Aptos" w:cs="Aptos" w:eastAsia="Aptos" w:hAnsi="Aptos"/>
-          <w:color w:val="000000"/>
-          <w:sz w:val="24"/>
-          <w:szCs w:val="24"/>
-          <w:rtl w:val="false"/>
-        </w:rPr>
-        <w:t xml:space="preserve">CRURATED — PHP Software Developer, concurrent part-time consulting engagement</w:t>
-      </w:r>
-      <w:bookmarkEnd w:id="1"/>
-    </w:p>
-    <w:p>
-      <w:pPr>
-        <w:bidi w:val="false"/>
-        <w:spacing w:after="120" w:before="120" w:line="259.20000000000005"/>
-        <w:jc w:val="left"/>
-        <w:keepNext/>
-      </w:pPr>
-      <w:r>
-        <w:rPr>
-          <w:rFonts w:ascii="Aptos" w:cs="Aptos" w:eastAsia="Aptos" w:hAnsi="Aptos"/>
-          <w:color w:val="000000"/>
-          <w:sz w:val="24"/>
-          <w:szCs w:val="24"/>
-          <w:rtl w:val="false"/>
-        </w:rPr>
-        <w:t xml:space="preserve">August 2024–January 2026</w:t>
+        <w:t xml:space="preserve">Designed modular event-stream architecture for a production DataLake, reducing setup of a new analytics stream from several days to under four hours.</w:t>
       </w:r>
     </w:p>
     <w:p>
@@ -494,7 +538,7 @@
           <w:szCs w:val="24"/>
           <w:rtl w:val="false"/>
         </w:rPr>
-        <w:t xml:space="preserve">Owned the production DataLake and event analytics work as throughput grew by more than tenfold, with Grafana and operational observation used to assess the increase.</w:t>
+        <w:t xml:space="preserve">Maintained event delivery reliability above 99.9% through fault-tolerant routing, retries and operational monitoring.</w:t>
       </w:r>
     </w:p>
     <w:p>
@@ -515,7 +559,75 @@
           <w:szCs w:val="24"/>
           <w:rtl w:val="false"/>
         </w:rPr>
-        <w:t xml:space="preserve">Delivered parallel publication of event versions in production under full technical ownership.</w:t>
+        <w:t xml:space="preserve">Designed versioned event schemas and parallel production publication so analytics consumers could evolve schemas while new events continued to be delivered.</w:t>
+      </w:r>
+    </w:p>
+    <w:p>
+      <w:pPr>
+        <w:bidi w:val="false"/>
+        <w:spacing w:after="120" w:before="120" w:line="259.20000000000005"/>
+        <w:jc w:val="left"/>
+      </w:pPr>
+      <w:r>
+        <w:rPr>
+          <w:rFonts w:ascii="Aptos" w:cs="Aptos" w:eastAsia="Aptos" w:hAnsi="Aptos"/>
+          <w:b/>
+          <w:bCs/>
+          <w:color w:val="000000"/>
+          <w:sz w:val="24"/>
+          <w:szCs w:val="24"/>
+          <w:rtl w:val="false"/>
+        </w:rPr>
+        <w:t xml:space="preserve">Technologies:</w:t>
+      </w:r>
+      <w:r>
+        <w:rPr>
+          <w:rFonts w:ascii="Aptos" w:cs="Aptos" w:eastAsia="Aptos" w:hAnsi="Aptos"/>
+          <w:color w:val="000000"/>
+          <w:sz w:val="24"/>
+          <w:szCs w:val="24"/>
+          <w:rtl w:val="false"/>
+        </w:rPr>
+        <w:t xml:space="preserve"> PHP, Laravel, AWS EventBridge, queues, REST APIs, event-driven architecture</w:t>
+      </w:r>
+    </w:p>
+    <w:p>
+      <w:pPr>
+        <w:pStyle w:val="3"/>
+        <w:pStyle w:val="Heading3"/>
+        <w:bidi w:val="false"/>
+        <w:spacing w:after="120" w:before="240"/>
+        <w:keepNext/>
+      </w:pPr>
+      <w:bookmarkStart w:name="_Toc_airSlate_Software_Developer_Programming__7" w:id="1"/>
+      <w:r>
+        <w:rPr>
+          <w:rFonts w:ascii="Aptos" w:cs="Aptos" w:eastAsia="Aptos" w:hAnsi="Aptos"/>
+          <w:color w:val="000000"/>
+          <w:sz w:val="24"/>
+          <w:szCs w:val="24"/>
+          <w:rtl w:val="false"/>
+        </w:rPr>
+        <w:t xml:space="preserve">airSlate — Software Developer / Programming Team Lead</w:t>
+      </w:r>
+      <w:bookmarkEnd w:id="1"/>
+    </w:p>
+    <w:p>
+      <w:pPr>
+        <w:bidi w:val="false"/>
+        <w:spacing w:after="120" w:before="120" w:line="259.20000000000005"/>
+        <w:jc w:val="left"/>
+        <w:keepNext/>
+      </w:pPr>
+      <w:r>
+        <w:rPr>
+          <w:rFonts w:ascii="Aptos" w:cs="Aptos" w:eastAsia="Aptos" w:hAnsi="Aptos"/>
+          <w:color w:val="000000"/>
+          <w:sz w:val="24"/>
+          <w:szCs w:val="24"/>
+          <w:rtl w:val="false"/>
+        </w:rPr>
+        <w:t xml:space="preserve">February 2021 – August 2023</w:t>
       </w:r>
     </w:p>
     <w:p>
@@ -536,63 +648,7 @@
           <w:szCs w:val="24"/>
           <w:rtl w:val="false"/>
         </w:rPr>
-        <w:t xml:space="preserve">Owned the production Crutrade integration covering authentication and OTP, account linking, collection import and export, purchase-ownership verification and request/response logging.</w:t>
-      </w:r>
-    </w:p>
-    <w:p>
-      <w:pPr>
-        <w:bidi w:val="false"/>
-        <w:spacing w:after="120" w:before="120" w:line="259.20000000000005"/>
-        <w:jc w:val="left"/>
-      </w:pPr>
-      <w:r>
-        <w:rPr>
-          <w:rFonts w:ascii="Aptos" w:cs="Aptos" w:eastAsia="Aptos" w:hAnsi="Aptos"/>
-          <w:color w:val="000000"/>
-          <w:sz w:val="24"/>
-          <w:szCs w:val="24"/>
-          <w:rtl w:val="false"/>
-        </w:rPr>
-        <w:t xml:space="preserve">Technologies: PHP, event analytics, DataLake, EventBridge, REST APIs</w:t>
-      </w:r>
-    </w:p>
-    <w:p>
-      <w:pPr>
-        <w:pStyle w:val="3"/>
-        <w:pStyle w:val="Heading3"/>
-        <w:bidi w:val="false"/>
-        <w:spacing w:after="120" w:before="240"/>
-        <w:keepNext/>
-      </w:pPr>
-      <w:bookmarkStart w:name="_Toc_airSlate_Software_Developer_Programming__7" w:id="1"/>
-      <w:r>
-        <w:rPr>
-          <w:rFonts w:ascii="Aptos" w:cs="Aptos" w:eastAsia="Aptos" w:hAnsi="Aptos"/>
-          <w:color w:val="000000"/>
-          <w:sz w:val="24"/>
-          <w:szCs w:val="24"/>
-          <w:rtl w:val="false"/>
-        </w:rPr>
-        <w:t xml:space="preserve">airSlate — Software Developer / Programming Team Lead</w:t>
-      </w:r>
-      <w:bookmarkEnd w:id="1"/>
-    </w:p>
-    <w:p>
-      <w:pPr>
-        <w:bidi w:val="false"/>
-        <w:spacing w:after="120" w:before="120" w:line="259.20000000000005"/>
-        <w:jc w:val="left"/>
-        <w:keepNext/>
-      </w:pPr>
-      <w:r>
-        <w:rPr>
-          <w:rFonts w:ascii="Aptos" w:cs="Aptos" w:eastAsia="Aptos" w:hAnsi="Aptos"/>
-          <w:color w:val="000000"/>
-          <w:sz w:val="24"/>
-          <w:szCs w:val="24"/>
-          <w:rtl w:val="false"/>
-        </w:rPr>
-        <w:t xml:space="preserve">February 2021–August 2023</w:t>
+        <w:t xml:space="preserve">Reduced peak load on the main database by removing bottlenecks and redistributing workload, improving service stability during high-traffic periods.</w:t>
       </w:r>
     </w:p>
     <w:p>
@@ -613,49 +669,7 @@
           <w:szCs w:val="24"/>
           <w:rtl w:val="false"/>
         </w:rPr>
-        <w:t xml:space="preserve">Reduced peak load on the main database by removing bottlenecks and redistributing work, improving service stability during high-traffic periods.</w:t>
-      </w:r>
-    </w:p>
-    <w:p>
-      <w:pPr>
-        <w:pStyle w:val="ListParagraph"/>
-        <w:numPr>
-          <w:ilvl w:val="0"/>
-          <w:numId w:val="1"/>
-        </w:numPr>
-        <w:bidi w:val="false"/>
-        <w:spacing w:after="60" w:before="60"/>
-      </w:pPr>
-      <w:r>
-        <w:rPr>
-          <w:rFonts w:ascii="Aptos" w:cs="Aptos" w:eastAsia="Aptos" w:hAnsi="Aptos"/>
-          <w:color w:val="000000"/>
-          <w:sz w:val="24"/>
-          <w:szCs w:val="24"/>
-          <w:rtl w:val="false"/>
-        </w:rPr>
-        <w:t xml:space="preserve">Delivered production fixes after tracing failures through logs, monitoring and SRE dashboards, strengthening day-to-day service operation.</w:t>
-      </w:r>
-    </w:p>
-    <w:p>
-      <w:pPr>
-        <w:pStyle w:val="ListParagraph"/>
-        <w:numPr>
-          <w:ilvl w:val="0"/>
-          <w:numId w:val="1"/>
-        </w:numPr>
-        <w:bidi w:val="false"/>
-        <w:spacing w:after="60" w:before="60"/>
-      </w:pPr>
-      <w:r>
-        <w:rPr>
-          <w:rFonts w:ascii="Aptos" w:cs="Aptos" w:eastAsia="Aptos" w:hAnsi="Aptos"/>
-          <w:color w:val="000000"/>
-          <w:sz w:val="24"/>
-          <w:szCs w:val="24"/>
-          <w:rtl w:val="false"/>
-        </w:rPr>
-        <w:t xml:space="preserve">Developed a Laravel/Symfony logger package to the company's interservice communication standard, giving teams a shared logging implementation.</w:t>
+        <w:t xml:space="preserve">Developed a Laravel/Symfony logger package aligned with the interservice communication standard, giving teams a shared logging implementation.</w:t>
       </w:r>
     </w:p>
     <w:p>
@@ -667,32 +681,43 @@
       <w:r>
         <w:rPr>
           <w:rFonts w:ascii="Aptos" w:cs="Aptos" w:eastAsia="Aptos" w:hAnsi="Aptos"/>
-          <w:color w:val="000000"/>
-          <w:sz w:val="24"/>
-          <w:szCs w:val="24"/>
-          <w:rtl w:val="false"/>
-        </w:rPr>
-        <w:t xml:space="preserve">Technologies: PHP, Laravel, Symfony, MySQL, Elasticsearch, RabbitMQ, AWS, Prometheus, CI/CD</w:t>
-      </w:r>
-    </w:p>
-    <w:p>
-      <w:pPr>
-        <w:pStyle w:val="3"/>
-        <w:pStyle w:val="Heading3"/>
+          <w:b/>
+          <w:bCs/>
+          <w:color w:val="000000"/>
+          <w:sz w:val="24"/>
+          <w:szCs w:val="24"/>
+          <w:rtl w:val="false"/>
+        </w:rPr>
+        <w:t xml:space="preserve">Technologies:</w:t>
+      </w:r>
+      <w:r>
+        <w:rPr>
+          <w:rFonts w:ascii="Aptos" w:cs="Aptos" w:eastAsia="Aptos" w:hAnsi="Aptos"/>
+          <w:color w:val="000000"/>
+          <w:sz w:val="24"/>
+          <w:szCs w:val="24"/>
+          <w:rtl w:val="false"/>
+        </w:rPr>
+        <w:t xml:space="preserve"> PHP, Laravel, Symfony, MySQL, monitoring</w:t>
+      </w:r>
+    </w:p>
+    <w:p>
+      <w:pPr>
+        <w:pStyle w:val="2"/>
+        <w:pStyle w:val="Heading2"/>
         <w:bidi w:val="false"/>
         <w:spacing w:after="120" w:before="240"/>
-        <w:keepNext/>
-      </w:pPr>
-      <w:bookmarkStart w:name="_Toc_Hyprr_Technical_Lead_8" w:id="1"/>
-      <w:r>
-        <w:rPr>
-          <w:rFonts w:ascii="Aptos" w:cs="Aptos" w:eastAsia="Aptos" w:hAnsi="Aptos"/>
-          <w:color w:val="000000"/>
-          <w:sz w:val="24"/>
-          <w:szCs w:val="24"/>
-          <w:rtl w:val="false"/>
-        </w:rPr>
-        <w:t xml:space="preserve">Hyprr — Technical Lead</w:t>
+      </w:pPr>
+      <w:bookmarkStart w:name="_Toc_Education_8" w:id="1"/>
+      <w:r>
+        <w:rPr>
+          <w:rFonts w:ascii="Aptos" w:cs="Aptos" w:eastAsia="Aptos" w:hAnsi="Aptos"/>
+          <w:color w:val="000000"/>
+          <w:sz w:val="28"/>
+          <w:szCs w:val="28"/>
+          <w:rtl w:val="false"/>
+        </w:rPr>
+        <w:t xml:space="preserve">Education</w:t>
       </w:r>
       <w:bookmarkEnd w:id="1"/>
     </w:p>
@@ -701,60 +726,37 @@
         <w:bidi w:val="false"/>
         <w:spacing w:after="120" w:before="120" w:line="259.20000000000005"/>
         <w:jc w:val="left"/>
-        <w:keepNext/>
-      </w:pPr>
-      <w:r>
-        <w:rPr>
-          <w:rFonts w:ascii="Aptos" w:cs="Aptos" w:eastAsia="Aptos" w:hAnsi="Aptos"/>
-          <w:color w:val="000000"/>
-          <w:sz w:val="24"/>
-          <w:szCs w:val="24"/>
-          <w:rtl w:val="false"/>
-        </w:rPr>
-        <w:t xml:space="preserve">November 2019–January 2021</w:t>
-      </w:r>
-    </w:p>
-    <w:p>
-      <w:pPr>
-        <w:pStyle w:val="ListParagraph"/>
-        <w:numPr>
-          <w:ilvl w:val="0"/>
-          <w:numId w:val="1"/>
-        </w:numPr>
-        <w:bidi w:val="false"/>
-        <w:spacing w:after="60" w:before="60"/>
-      </w:pPr>
-      <w:r>
-        <w:rPr>
-          <w:rFonts w:ascii="Aptos" w:cs="Aptos" w:eastAsia="Aptos" w:hAnsi="Aptos"/>
-          <w:color w:val="000000"/>
-          <w:sz w:val="24"/>
-          <w:szCs w:val="24"/>
-          <w:rtl w:val="false"/>
-        </w:rPr>
-        <w:t xml:space="preserve">Helped bring the creator platform from prototype to closed beta in less than six months through technical leadership and backend delivery.</w:t>
-      </w:r>
-    </w:p>
-    <w:p>
-      <w:pPr>
-        <w:pStyle w:val="ListParagraph"/>
-        <w:numPr>
-          <w:ilvl w:val="0"/>
-          <w:numId w:val="1"/>
-        </w:numPr>
-        <w:bidi w:val="false"/>
-        <w:spacing w:after="60" w:before="60"/>
-      </w:pPr>
-      <w:r>
-        <w:rPr>
-          <w:rFonts w:ascii="Aptos" w:cs="Aptos" w:eastAsia="Aptos" w:hAnsi="Aptos"/>
-          <w:color w:val="000000"/>
-          <w:sz w:val="24"/>
-          <w:szCs w:val="24"/>
-          <w:rtl w:val="false"/>
-        </w:rPr>
-        <w:t xml:space="preserve">Defined the technology roadmap with the CTO and helped establish the core product stack, including microservice and serverless design considerations.</w:t>
-      </w:r>
+      </w:pPr>
+      <w:r>
+        <w:rPr>
+          <w:rFonts w:ascii="Aptos" w:cs="Aptos" w:eastAsia="Aptos" w:hAnsi="Aptos"/>
+          <w:color w:val="000000"/>
+          <w:sz w:val="24"/>
+          <w:szCs w:val="24"/>
+          <w:rtl w:val="false"/>
+        </w:rPr>
+        <w:t xml:space="preserve">MSc in Computer Science, National Technical University, Kharkiv, Ukraine (2003–2008)</w:t>
+      </w:r>
+    </w:p>
+    <w:p>
+      <w:pPr>
+        <w:pStyle w:val="2"/>
+        <w:pStyle w:val="Heading2"/>
+        <w:bidi w:val="false"/>
+        <w:spacing w:after="120" w:before="240"/>
+      </w:pPr>
+      <w:bookmarkStart w:name="_Toc_Languages_9" w:id="1"/>
+      <w:r>
+        <w:rPr>
+          <w:rFonts w:ascii="Aptos" w:cs="Aptos" w:eastAsia="Aptos" w:hAnsi="Aptos"/>
+          <w:color w:val="000000"/>
+          <w:sz w:val="28"/>
+          <w:szCs w:val="28"/>
+          <w:rtl w:val="false"/>
+        </w:rPr>
+        <w:t xml:space="preserve">Languages</w:t>
+      </w:r>
+      <w:bookmarkEnd w:id="1"/>
     </w:p>
     <w:p>
       <w:pPr>
@@ -770,81 +772,7 @@
           <w:szCs w:val="24"/>
           <w:rtl w:val="false"/>
         </w:rPr>
-        <w:t xml:space="preserve">Technologies: Go, PHP, Laravel, MySQL, AWS, Kubernetes, microservices, CI/CD</w:t>
-      </w:r>
-    </w:p>
-    <w:p>
-      <w:pPr>
-        <w:pStyle w:val="2"/>
-        <w:pStyle w:val="Heading2"/>
-        <w:bidi w:val="false"/>
-        <w:spacing w:after="120" w:before="240"/>
-      </w:pPr>
-      <w:bookmarkStart w:name="_Toc_Education_9" w:id="1"/>
-      <w:r>
-        <w:rPr>
-          <w:rFonts w:ascii="Aptos" w:cs="Aptos" w:eastAsia="Aptos" w:hAnsi="Aptos"/>
-          <w:color w:val="000000"/>
-          <w:sz w:val="28"/>
-          <w:szCs w:val="28"/>
-          <w:rtl w:val="false"/>
-        </w:rPr>
-        <w:t xml:space="preserve">Education</w:t>
-      </w:r>
-      <w:bookmarkEnd w:id="1"/>
-    </w:p>
-    <w:p>
-      <w:pPr>
-        <w:bidi w:val="false"/>
-        <w:spacing w:after="120" w:before="120" w:line="259.20000000000005"/>
-        <w:jc w:val="left"/>
-      </w:pPr>
-      <w:r>
-        <w:rPr>
-          <w:rFonts w:ascii="Aptos" w:cs="Aptos" w:eastAsia="Aptos" w:hAnsi="Aptos"/>
-          <w:color w:val="000000"/>
-          <w:sz w:val="24"/>
-          <w:szCs w:val="24"/>
-          <w:rtl w:val="false"/>
-        </w:rPr>
-        <w:t xml:space="preserve">MSc in Computer Science, National Technical University, Kharkiv, Ukraine (2003–2008)</w:t>
-      </w:r>
-    </w:p>
-    <w:p>
-      <w:pPr>
-        <w:pStyle w:val="2"/>
-        <w:pStyle w:val="Heading2"/>
-        <w:bidi w:val="false"/>
-        <w:spacing w:after="120" w:before="240"/>
-      </w:pPr>
-      <w:bookmarkStart w:name="_Toc_Languages_10" w:id="1"/>
-      <w:r>
-        <w:rPr>
-          <w:rFonts w:ascii="Aptos" w:cs="Aptos" w:eastAsia="Aptos" w:hAnsi="Aptos"/>
-          <w:color w:val="000000"/>
-          <w:sz w:val="28"/>
-          <w:szCs w:val="28"/>
-          <w:rtl w:val="false"/>
-        </w:rPr>
-        <w:t xml:space="preserve">Languages</w:t>
-      </w:r>
-      <w:bookmarkEnd w:id="1"/>
-    </w:p>
-    <w:p>
-      <w:pPr>
-        <w:bidi w:val="false"/>
-        <w:spacing w:after="120" w:before="120" w:line="259.20000000000005"/>
-        <w:jc w:val="left"/>
-      </w:pPr>
-      <w:r>
-        <w:rPr>
-          <w:rFonts w:ascii="Aptos" w:cs="Aptos" w:eastAsia="Aptos" w:hAnsi="Aptos"/>
-          <w:color w:val="000000"/>
-          <w:sz w:val="24"/>
-          <w:szCs w:val="24"/>
-          <w:rtl w:val="false"/>
-        </w:rPr>
-        <w:t xml:space="preserve">Ukrainian (native) | English (professional working)</w:t>
+        <w:t xml:space="preserve">Ukrainian (native), English (upper-intermediate)</w:t>
       </w:r>
     </w:p>
     <w:sectPr>

</xml_diff>

<commit_message>
Lead six CVs with PII and PHI telephony safeguards
</commit_message>
<xml_diff>
--- a/registry/jobs/2026-09-14_180905_talmatic_senior-go-golang-software-engineer/application/CV_ValentinNikolaev_talmatic_SeniorGoGolangSoftwareEngineer.docx
+++ b/registry/jobs/2026-09-14_180905_talmatic_senior-go-golang-software-engineer/application/CV_ValentinNikolaev_talmatic_SeniorGoGolangSoftwareEngineer.docx
@@ -55,7 +55,7 @@
         </w:rPr>
         <w:t xml:space="preserve">Rome, Italy | </w:t>
       </w:r>
-      <w:hyperlink w:history="1" r:id="rIdqvhuvo9atqvxcmpfzcfxt">
+      <w:hyperlink w:history="1" r:id="rIdp2lnx06r0hwjbyyecmbou">
         <w:r>
           <w:rPr>
             <w:rFonts w:ascii="Aptos" w:cs="Aptos" w:eastAsia="Aptos" w:hAnsi="Aptos"/>
@@ -99,7 +99,7 @@
         </w:rPr>
         <w:t xml:space="preserve">LinkedIn: </w:t>
       </w:r>
-      <w:hyperlink w:history="1" r:id="rIdxh0hf0hmvp5q2dgrrth8w">
+      <w:hyperlink w:history="1" r:id="rIduhtk9rizwsudgxovozwpm">
         <w:r>
           <w:rPr>
             <w:rFonts w:ascii="Aptos" w:cs="Aptos" w:eastAsia="Aptos" w:hAnsi="Aptos"/>
@@ -122,7 +122,7 @@
         </w:rPr>
         <w:t xml:space="preserve"> | GitHub: </w:t>
       </w:r>
-      <w:hyperlink w:history="1" r:id="rIdrt2osbcqtdya1f9hz9yne">
+      <w:hyperlink w:history="1" r:id="rIdenv4enozc-cpincidpfo4">
         <w:r>
           <w:rPr>
             <w:rFonts w:ascii="Aptos" w:cs="Aptos" w:eastAsia="Aptos" w:hAnsi="Aptos"/>
@@ -170,7 +170,7 @@
           <w:szCs w:val="24"/>
           <w:rtl w:val="false"/>
         </w:rPr>
-        <w:t xml:space="preserve">Backend engineer with more than 15 years of experience in Go and PHP production systems. I design services that connect external platforms, make operational failure visible and keep data flows maintainable as they evolve. Recent work includes a secure Amazon Connect backend, a multi-tenant Go integration gateway and resilience improvements for support automation. I also bring experience with event-driven PHP systems, AWS, SQL performance work and cross-service logging standards.</w:t>
+        <w:t xml:space="preserve">Backend engineer with more than 15 years of experience in Go and PHP production systems. I design privacy-sensitive backend systems that connect external platforms, make operational failure visible and keep data flows maintainable as they evolve. Recent work includes a PII/PHI-protected Amazon Connect platform, a multi-tenant Go integration gateway and resilience improvements for support automation. I also bring experience with event-driven PHP systems, AWS, SQL performance work and cross-service logging standards.</w:t>
       </w:r>
     </w:p>
     <w:p>
@@ -365,7 +365,49 @@
           <w:szCs w:val="24"/>
           <w:rtl w:val="false"/>
         </w:rPr>
-        <w:t xml:space="preserve">Architected and released an Amazon Connect outbound-calling backend, using federated agent access and masked customer numbers; it passed security sign-off without requiring individual AWS accounts or SAML setup.</w:t>
+        <w:t xml:space="preserve">Owned the architecture and backend for a health-domain Amazon Connect platform designed around PII/PHI protection: customer numbers were resolved server-side, masked in the browser and logs, and purged from Connect by TTL; it passed formal security and call-recording compliance reviews before production.</w:t>
+      </w:r>
+    </w:p>
+    <w:p>
+      <w:pPr>
+        <w:pStyle w:val="ListParagraph"/>
+        <w:numPr>
+          <w:ilvl w:val="0"/>
+          <w:numId w:val="1"/>
+        </w:numPr>
+        <w:bidi w:val="false"/>
+        <w:spacing w:after="60" w:before="60"/>
+      </w:pPr>
+      <w:r>
+        <w:rPr>
+          <w:rFonts w:ascii="Aptos" w:cs="Aptos" w:eastAsia="Aptos" w:hAnsi="Aptos"/>
+          <w:color w:val="000000"/>
+          <w:sz w:val="24"/>
+          <w:szCs w:val="24"/>
+          <w:rtl w:val="false"/>
+        </w:rPr>
+        <w:t xml:space="preserve">Built backend-controlled lawful-calling safeguards for customer-timezone windows, holidays, do-not-call enforcement and opt-out withdrawal, with Amazon Connect retries set to zero so scheduled calls could not bypass those controls.</w:t>
+      </w:r>
+    </w:p>
+    <w:p>
+      <w:pPr>
+        <w:pStyle w:val="ListParagraph"/>
+        <w:numPr>
+          <w:ilvl w:val="0"/>
+          <w:numId w:val="1"/>
+        </w:numPr>
+        <w:bidi w:val="false"/>
+        <w:spacing w:after="60" w:before="60"/>
+      </w:pPr>
+      <w:r>
+        <w:rPr>
+          <w:rFonts w:ascii="Aptos" w:cs="Aptos" w:eastAsia="Aptos" w:hAnsi="Aptos"/>
+          <w:color w:val="000000"/>
+          <w:sz w:val="24"/>
+          <w:szCs w:val="24"/>
+          <w:rtl w:val="false"/>
+        </w:rPr>
+        <w:t xml:space="preserve">Implemented least-privilege agent federation through Entra and AssumeRole/GetFederationToken, separating diagnostics and administration access while avoiding per-agent AWS accounts and a SAML application.</w:t>
       </w:r>
     </w:p>
     <w:p>

</xml_diff>